<commit_message>
Fase 2: documentación técnica, informe de avance 2.4 y autoevaluaciones de Joel
- Pruebas: 24 casos de prueba con resultados reales (20 aprobados, 1 observado, 3 pendientes)
- Requisitos no funcionales: 19 requisitos con criterios verificables y estado
- Retrospectivas por sprint (1 a 5) con acciones y responsables
- Modelo de datos y Diagramas UML (casos de uso, clases, componentes y secuencia)
- Evidencias de sistema: README de la aplicación, persistencia de datos y archivos de ejemplo
- Informe de avance 2.4 (Español); se elimina la copia duplicada sin completar
- Medina_Joel 1.1, 1.2 y 1.3 completados
- README: metodología en cascada con prácticas ágiles en la implementación
</commit_message>
<xml_diff>
--- a/Fase 1/Evidencias Individuales/Medina_Joel_1.1_APT122_AutoevaluacionCompetenciasFase1.docx
+++ b/Fase 1/Evidencias Individuales/Medina_Joel_1.1_APT122_AutoevaluacionCompetenciasFase1.docx
@@ -859,7 +859,7 @@
                 <w:sz w:val="24"/>
                 <w:szCs w:val="24"/>
               </w:rPr>
-              <w:t>Escuela</w:t>
+              <w:t>Escuela de Informática y Telecomunicaciones</w:t>
             </w:r>
           </w:p>
         </w:tc>
@@ -920,6 +920,9 @@
                 <w:szCs w:val="24"/>
               </w:rPr>
             </w:pPr>
+            <w:r>
+              <w:t>Joel Jesús Medina Morales</w:t>
+            </w:r>
           </w:p>
         </w:tc>
       </w:tr>
@@ -976,6 +979,9 @@
                 <w:szCs w:val="24"/>
               </w:rPr>
             </w:pPr>
+            <w:r>
+              <w:t>Ingeniería en Informática</w:t>
+            </w:r>
           </w:p>
         </w:tc>
       </w:tr>
@@ -1035,6 +1041,9 @@
                 <w:szCs w:val="24"/>
               </w:rPr>
             </w:pPr>
+            <w:r>
+              <w:t>[COMPLETAR: año de ingreso]</w:t>
+            </w:r>
           </w:p>
         </w:tc>
       </w:tr>
@@ -1411,6 +1420,9 @@
                 <w:szCs w:val="18"/>
               </w:rPr>
             </w:pPr>
+            <w:r>
+              <w:t>Programación de software</w:t>
+            </w:r>
           </w:p>
         </w:tc>
         <w:tc>
@@ -1429,6 +1441,7 @@
                 <w:szCs w:val="18"/>
               </w:rPr>
             </w:pPr>
+            <w:r/>
           </w:p>
         </w:tc>
         <w:tc>
@@ -1447,6 +1460,9 @@
                 <w:szCs w:val="18"/>
               </w:rPr>
             </w:pPr>
+            <w:r>
+              <w:t>X</w:t>
+            </w:r>
           </w:p>
         </w:tc>
         <w:tc>
@@ -1465,6 +1481,7 @@
                 <w:szCs w:val="18"/>
               </w:rPr>
             </w:pPr>
+            <w:r/>
           </w:p>
         </w:tc>
         <w:tc>
@@ -1483,6 +1500,7 @@
                 <w:szCs w:val="18"/>
               </w:rPr>
             </w:pPr>
+            <w:r/>
           </w:p>
         </w:tc>
         <w:tc>
@@ -1501,6 +1519,7 @@
                 <w:szCs w:val="18"/>
               </w:rPr>
             </w:pPr>
+            <w:r/>
           </w:p>
         </w:tc>
         <w:tc>
@@ -1519,6 +1538,9 @@
                 <w:szCs w:val="18"/>
               </w:rPr>
             </w:pPr>
+            <w:r>
+              <w:t>Programo a diario en mi trabajo como ingeniero de datos (Python y SQL en pipelines de AWS Glue y Airflow) y en el Capstone desarrollé en GDScript el sistema de turnos, el daño, el ataque con timing y los menús. Me falta reforzar buenas prácticas propias de videojuegos.</w:t>
+            </w:r>
           </w:p>
         </w:tc>
       </w:tr>
@@ -1544,6 +1566,9 @@
                 <w:szCs w:val="18"/>
               </w:rPr>
             </w:pPr>
+            <w:r>
+              <w:t>Arquitectura de software</w:t>
+            </w:r>
           </w:p>
         </w:tc>
         <w:tc>
@@ -1562,6 +1587,7 @@
                 <w:szCs w:val="18"/>
               </w:rPr>
             </w:pPr>
+            <w:r/>
           </w:p>
         </w:tc>
         <w:tc>
@@ -1580,6 +1606,7 @@
                 <w:szCs w:val="18"/>
               </w:rPr>
             </w:pPr>
+            <w:r/>
           </w:p>
         </w:tc>
         <w:tc>
@@ -1598,6 +1625,9 @@
                 <w:szCs w:val="18"/>
               </w:rPr>
             </w:pPr>
+            <w:r>
+              <w:t>X</w:t>
+            </w:r>
           </w:p>
         </w:tc>
         <w:tc>
@@ -1616,6 +1646,7 @@
                 <w:szCs w:val="18"/>
               </w:rPr>
             </w:pPr>
+            <w:r/>
           </w:p>
         </w:tc>
         <w:tc>
@@ -1634,6 +1665,7 @@
                 <w:szCs w:val="18"/>
               </w:rPr>
             </w:pPr>
+            <w:r/>
           </w:p>
         </w:tc>
         <w:tc>
@@ -1652,6 +1684,9 @@
                 <w:szCs w:val="18"/>
               </w:rPr>
             </w:pPr>
+            <w:r>
+              <w:t>Entiendo la separación en capas y componentes y la aplico en plataformas de datos (S3, Glue, Redshift). En el Capstone usé señales y autoloads, pero la arquitectura general del juego la definió otro integrante, por lo que debo practicar más el diseño desde cero.</w:t>
+            </w:r>
           </w:p>
         </w:tc>
       </w:tr>
@@ -1676,6 +1711,9 @@
                 <w:szCs w:val="18"/>
               </w:rPr>
             </w:pPr>
+            <w:r>
+              <w:t>Calidad de software</w:t>
+            </w:r>
           </w:p>
         </w:tc>
         <w:tc>
@@ -1694,6 +1732,7 @@
                 <w:szCs w:val="18"/>
               </w:rPr>
             </w:pPr>
+            <w:r/>
           </w:p>
         </w:tc>
         <w:tc>
@@ -1712,6 +1751,7 @@
                 <w:szCs w:val="18"/>
               </w:rPr>
             </w:pPr>
+            <w:r/>
           </w:p>
         </w:tc>
         <w:tc>
@@ -1730,6 +1770,9 @@
                 <w:szCs w:val="18"/>
               </w:rPr>
             </w:pPr>
+            <w:r>
+              <w:t>X</w:t>
+            </w:r>
           </w:p>
         </w:tc>
         <w:tc>
@@ -1748,6 +1791,7 @@
                 <w:szCs w:val="18"/>
               </w:rPr>
             </w:pPr>
+            <w:r/>
           </w:p>
         </w:tc>
         <w:tc>
@@ -1766,6 +1810,7 @@
                 <w:szCs w:val="18"/>
               </w:rPr>
             </w:pPr>
+            <w:r/>
           </w:p>
         </w:tc>
         <w:tc>
@@ -1784,6 +1829,9 @@
                 <w:szCs w:val="18"/>
               </w:rPr>
             </w:pPr>
+            <w:r>
+              <w:t>Valido mi trabajo con pruebas manuales documentadas (casos de daño, victoria, derrota, timing y persistencia en las escenas de prueba), pero aún no escribo pruebas automatizadas, que es lo que debo fortalecer.</w:t>
+            </w:r>
           </w:p>
         </w:tc>
       </w:tr>
@@ -1808,6 +1856,9 @@
                 <w:szCs w:val="18"/>
               </w:rPr>
             </w:pPr>
+            <w:r>
+              <w:t>Gestión de proyectos informáticos</w:t>
+            </w:r>
           </w:p>
         </w:tc>
         <w:tc>
@@ -1826,6 +1877,7 @@
                 <w:szCs w:val="18"/>
               </w:rPr>
             </w:pPr>
+            <w:r/>
           </w:p>
         </w:tc>
         <w:tc>
@@ -1844,6 +1896,7 @@
                 <w:szCs w:val="18"/>
               </w:rPr>
             </w:pPr>
+            <w:r/>
           </w:p>
         </w:tc>
         <w:tc>
@@ -1862,6 +1915,9 @@
                 <w:szCs w:val="18"/>
               </w:rPr>
             </w:pPr>
+            <w:r>
+              <w:t>X</w:t>
+            </w:r>
           </w:p>
         </w:tc>
         <w:tc>
@@ -1880,6 +1936,7 @@
                 <w:szCs w:val="18"/>
               </w:rPr>
             </w:pPr>
+            <w:r/>
           </w:p>
         </w:tc>
         <w:tc>
@@ -1898,6 +1955,7 @@
                 <w:szCs w:val="18"/>
               </w:rPr>
             </w:pPr>
+            <w:r/>
           </w:p>
         </w:tc>
         <w:tc>
@@ -1916,6 +1974,9 @@
                 <w:szCs w:val="18"/>
               </w:rPr>
             </w:pPr>
+            <w:r>
+              <w:t>Trabajo con tablero Trello, ramas y Pull Requests, y organicé el repositorio de evidencias del Capstone con backlogs y documentación. Me falta experiencia estimando y controlando plazos de un proyecto completo.</w:t>
+            </w:r>
           </w:p>
         </w:tc>
       </w:tr>
@@ -1940,6 +2001,9 @@
                 <w:szCs w:val="18"/>
               </w:rPr>
             </w:pPr>
+            <w:r>
+              <w:t>Análisis y planificación de requerimientos informáticos</w:t>
+            </w:r>
           </w:p>
         </w:tc>
         <w:tc>
@@ -1958,6 +2022,7 @@
                 <w:szCs w:val="18"/>
               </w:rPr>
             </w:pPr>
+            <w:r/>
           </w:p>
         </w:tc>
         <w:tc>
@@ -1976,6 +2041,9 @@
                 <w:szCs w:val="18"/>
               </w:rPr>
             </w:pPr>
+            <w:r>
+              <w:t>X</w:t>
+            </w:r>
           </w:p>
         </w:tc>
         <w:tc>
@@ -1994,6 +2062,7 @@
                 <w:szCs w:val="18"/>
               </w:rPr>
             </w:pPr>
+            <w:r/>
           </w:p>
         </w:tc>
         <w:tc>
@@ -2012,6 +2081,7 @@
                 <w:szCs w:val="18"/>
               </w:rPr>
             </w:pPr>
+            <w:r/>
           </w:p>
         </w:tc>
         <w:tc>
@@ -2030,6 +2100,7 @@
                 <w:szCs w:val="18"/>
               </w:rPr>
             </w:pPr>
+            <w:r/>
           </w:p>
         </w:tc>
         <w:tc>
@@ -2048,6 +2119,9 @@
                 <w:szCs w:val="18"/>
               </w:rPr>
             </w:pPr>
+            <w:r>
+              <w:t>En mi trabajo levanto requerimientos de datos con áreas de negocio de servicios financieros y los transformo en tareas técnicas. Debo reforzar la documentación formal (historias de usuario y criterios de aceptación).</w:t>
+            </w:r>
           </w:p>
         </w:tc>
       </w:tr>
@@ -2072,6 +2146,9 @@
                 <w:szCs w:val="18"/>
               </w:rPr>
             </w:pPr>
+            <w:r>
+              <w:t>Análisis y desarrollo de modelos de datos</w:t>
+            </w:r>
           </w:p>
         </w:tc>
         <w:tc>
@@ -2090,6 +2167,7 @@
                 <w:szCs w:val="18"/>
               </w:rPr>
             </w:pPr>
+            <w:r/>
           </w:p>
         </w:tc>
         <w:tc>
@@ -2108,6 +2186,9 @@
                 <w:szCs w:val="18"/>
               </w:rPr>
             </w:pPr>
+            <w:r>
+              <w:t>X</w:t>
+            </w:r>
           </w:p>
         </w:tc>
         <w:tc>
@@ -2126,6 +2207,7 @@
                 <w:szCs w:val="18"/>
               </w:rPr>
             </w:pPr>
+            <w:r/>
           </w:p>
         </w:tc>
         <w:tc>
@@ -2144,6 +2226,7 @@
                 <w:szCs w:val="18"/>
               </w:rPr>
             </w:pPr>
+            <w:r/>
           </w:p>
         </w:tc>
         <w:tc>
@@ -2162,6 +2245,7 @@
                 <w:szCs w:val="18"/>
               </w:rPr>
             </w:pPr>
+            <w:r/>
           </w:p>
         </w:tc>
         <w:tc>
@@ -2180,6 +2264,9 @@
                 <w:szCs w:val="18"/>
               </w:rPr>
             </w:pPr>
+            <w:r>
+              <w:t>Es mi área más fuerte: diseño y mantengo modelos en Redshift y MongoDB y flujos con Kafka. Aún puedo mejorar en modelado para aplicaciones distintas a analítica, como el guardado de partidas del juego.</w:t>
+            </w:r>
           </w:p>
         </w:tc>
       </w:tr>
@@ -2204,6 +2291,9 @@
                 <w:szCs w:val="18"/>
               </w:rPr>
             </w:pPr>
+            <w:r>
+              <w:t>Inteligencia de negocios</w:t>
+            </w:r>
           </w:p>
         </w:tc>
         <w:tc>
@@ -2222,6 +2312,7 @@
                 <w:szCs w:val="18"/>
               </w:rPr>
             </w:pPr>
+            <w:r/>
           </w:p>
         </w:tc>
         <w:tc>
@@ -2240,6 +2331,9 @@
                 <w:szCs w:val="18"/>
               </w:rPr>
             </w:pPr>
+            <w:r>
+              <w:t>X</w:t>
+            </w:r>
           </w:p>
         </w:tc>
         <w:tc>
@@ -2258,6 +2352,7 @@
                 <w:szCs w:val="18"/>
               </w:rPr>
             </w:pPr>
+            <w:r/>
           </w:p>
         </w:tc>
         <w:tc>
@@ -2276,6 +2371,7 @@
                 <w:szCs w:val="18"/>
               </w:rPr>
             </w:pPr>
+            <w:r/>
           </w:p>
         </w:tc>
         <w:tc>
@@ -2294,6 +2390,7 @@
                 <w:szCs w:val="18"/>
               </w:rPr>
             </w:pPr>
+            <w:r/>
           </w:p>
         </w:tc>
         <w:tc>
@@ -2312,6 +2409,9 @@
                 <w:szCs w:val="18"/>
               </w:rPr>
             </w:pPr>
+            <w:r>
+              <w:t>Mi trabajo alimenta la plataforma de datos que usan las áreas de negocio para reportes y análisis, y me gustaron Minería de Datos y Deep Learning. Me falta practicar más la etapa de visualización y presentación de resultados.</w:t>
+            </w:r>
           </w:p>
         </w:tc>
       </w:tr>
@@ -2336,6 +2436,9 @@
                 <w:szCs w:val="18"/>
               </w:rPr>
             </w:pPr>
+            <w:r>
+              <w:t>Inglés intermedio alto (certificación internacional)</w:t>
+            </w:r>
           </w:p>
         </w:tc>
         <w:tc>
@@ -2354,6 +2457,7 @@
                 <w:szCs w:val="18"/>
               </w:rPr>
             </w:pPr>
+            <w:r/>
           </w:p>
         </w:tc>
         <w:tc>
@@ -2372,6 +2476,7 @@
                 <w:szCs w:val="18"/>
               </w:rPr>
             </w:pPr>
+            <w:r/>
           </w:p>
         </w:tc>
         <w:tc>
@@ -2390,6 +2495,9 @@
                 <w:szCs w:val="18"/>
               </w:rPr>
             </w:pPr>
+            <w:r>
+              <w:t>X</w:t>
+            </w:r>
           </w:p>
         </w:tc>
         <w:tc>
@@ -2408,6 +2516,7 @@
                 <w:szCs w:val="18"/>
               </w:rPr>
             </w:pPr>
+            <w:r/>
           </w:p>
         </w:tc>
         <w:tc>
@@ -2426,6 +2535,7 @@
                 <w:szCs w:val="18"/>
               </w:rPr>
             </w:pPr>
+            <w:r/>
           </w:p>
         </w:tc>
         <w:tc>
@@ -2444,6 +2554,9 @@
                 <w:szCs w:val="18"/>
               </w:rPr>
             </w:pPr>
+            <w:r>
+              <w:t>[REVISAR] Leo documentación técnica en inglés todos los días en el trabajo, pero necesito practicar la expresión oral y escrita. [COMPLETAR si tienes certificación]</w:t>
+            </w:r>
           </w:p>
         </w:tc>
       </w:tr>

</xml_diff>